<commit_message>
Update CV document artifacts
</commit_message>
<xml_diff>
--- a/Hagai_Mozes_CV.docx
+++ b/Hagai_Mozes_CV.docx
@@ -77,15 +77,7 @@
             <w:sz w:val="17"/>
             <w:szCs w:val="17"/>
           </w:rPr>
-          <w:t>hagimo@gmail.co</w:t>
-        </w:r>
-        <w:r>
-          <w:rPr>
-            <w:color w:val="1F3A5F"/>
-            <w:sz w:val="17"/>
-            <w:szCs w:val="17"/>
-          </w:rPr>
-          <w:t>m</w:t>
+          <w:t>hagimo@gmail.com</w:t>
         </w:r>
       </w:hyperlink>
       <w:bookmarkEnd w:id="1"/>
@@ -104,23 +96,7 @@
             <w:sz w:val="17"/>
             <w:szCs w:val="17"/>
           </w:rPr>
-          <w:t>hmo</w:t>
-        </w:r>
-        <w:r>
-          <w:rPr>
-            <w:color w:val="1F3A5F"/>
-            <w:sz w:val="17"/>
-            <w:szCs w:val="17"/>
-          </w:rPr>
-          <w:t>z</w:t>
-        </w:r>
-        <w:r>
-          <w:rPr>
-            <w:color w:val="1F3A5F"/>
-            <w:sz w:val="17"/>
-            <w:szCs w:val="17"/>
-          </w:rPr>
-          <w:t>es.com</w:t>
+          <w:t>hmozes.com</w:t>
         </w:r>
       </w:hyperlink>
     </w:p>
@@ -132,7 +108,7 @@
         <w:spacing w:before="40" w:after="120"/>
         <w:jc w:val="center"/>
         <w:rPr>
-          <w:rFonts w:ascii="Futura Medium" w:hAnsi="Futura Medium" w:cs="Futura Medium" w:hint="cs"/>
+          <w:rFonts w:ascii="Futura Medium" w:hAnsi="Futura Medium" w:cs="Futura Medium"/>
           <w:sz w:val="18"/>
           <w:szCs w:val="18"/>
         </w:rPr>
@@ -316,7 +292,21 @@
           <w:sz w:val="19"/>
           <w:szCs w:val="19"/>
         </w:rPr>
-        <w:t>Pioneered LLM- and agent-based tooling, taking early prototypes through to production AI-enabled monitoring and debugging workflows that improved visibility into firmware systems.</w:t>
+        <w:t>Pioneered LLM</w:t>
+      </w:r>
+      <w:r>
+        <w:rPr>
+          <w:sz w:val="19"/>
+          <w:szCs w:val="19"/>
+        </w:rPr>
+        <w:t xml:space="preserve"> </w:t>
+      </w:r>
+      <w:r>
+        <w:rPr>
+          <w:sz w:val="19"/>
+          <w:szCs w:val="19"/>
+        </w:rPr>
+        <w:t>and agent-based tooling, taking early prototypes through to production AI-enabled monitoring and debugging workflows that improved visibility into firmware systems.</w:t>
       </w:r>
     </w:p>
     <w:p>
@@ -721,14 +711,7 @@
           <w:sz w:val="19"/>
           <w:szCs w:val="19"/>
         </w:rPr>
-        <w:t>cybersecurity</w:t>
-      </w:r>
-      <w:r>
-        <w:rPr>
-          <w:sz w:val="19"/>
-          <w:szCs w:val="19"/>
-        </w:rPr>
-        <w:t xml:space="preserve">, </w:t>
+        <w:t xml:space="preserve">cybersecurity, </w:t>
       </w:r>
       <w:r>
         <w:rPr>

</xml_diff>

<commit_message>
Added phyman phy agent to CV
</commit_message>
<xml_diff>
--- a/Hagai_Mozes_CV.docx
+++ b/Hagai_Mozes_CV.docx
@@ -1,6 +1,6 @@
 
 <file path=word/document.xml><?xml version="1.0" encoding="utf-8"?>
-<w:document xmlns:wpc="http://schemas.microsoft.com/office/word/2010/wordprocessingCanvas" xmlns:cx="http://schemas.microsoft.com/office/drawing/2014/chartex" xmlns:cx1="http://schemas.microsoft.com/office/drawing/2015/9/8/chartex" xmlns:cx2="http://schemas.microsoft.com/office/drawing/2015/10/21/chartex" xmlns:cx3="http://schemas.microsoft.com/office/drawing/2016/5/9/chartex" xmlns:cx4="http://schemas.microsoft.com/office/drawing/2016/5/10/chartex" xmlns:cx5="http://schemas.microsoft.com/office/drawing/2016/5/11/chartex" xmlns:cx6="http://schemas.microsoft.com/office/drawing/2016/5/12/chartex" xmlns:cx7="http://schemas.microsoft.com/office/drawing/2016/5/13/chartex" xmlns:cx8="http://schemas.microsoft.com/office/drawing/2016/5/14/chartex" xmlns:mc="http://schemas.openxmlformats.org/markup-compatibility/2006" xmlns:aink="http://schemas.microsoft.com/office/drawing/2016/ink" xmlns:am3d="http://schemas.microsoft.com/office/drawing/2017/model3d" xmlns:o="urn:schemas-microsoft-com:office:office" xmlns:oel="http://schemas.microsoft.com/office/2019/extlst" xmlns:r="http://schemas.openxmlformats.org/officeDocument/2006/relationships" xmlns:m="http://schemas.openxmlformats.org/officeDocument/2006/math" xmlns:v="urn:schemas-microsoft-com:vml" xmlns:wp14="http://schemas.microsoft.com/office/word/2010/wordprocessingDrawing" xmlns:wp="http://schemas.openxmlformats.org/drawingml/2006/wordprocessingDrawing" xmlns:w10="urn:schemas-microsoft-com:office:word" xmlns:w="http://schemas.openxmlformats.org/wordprocessingml/2006/main" xmlns:w14="http://schemas.microsoft.com/office/word/2010/wordml" xmlns:w15="http://schemas.microsoft.com/office/word/2012/wordml" xmlns:w16cex="http://schemas.microsoft.com/office/word/2018/wordml/cex" xmlns:w16cid="http://schemas.microsoft.com/office/word/2016/wordml/cid" xmlns:w16="http://schemas.microsoft.com/office/word/2018/wordml" xmlns:w16du="http://schemas.microsoft.com/office/word/2023/wordml/word16du" xmlns:w16sdtdh="http://schemas.microsoft.com/office/word/2020/wordml/sdtdatahash" xmlns:w16sdtfl="http://schemas.microsoft.com/office/word/2024/wordml/sdtformatlock" xmlns:w16se="http://schemas.microsoft.com/office/word/2015/wordml/symex" xmlns:wpg="http://schemas.microsoft.com/office/word/2010/wordprocessingGroup" xmlns:wpi="http://schemas.microsoft.com/office/word/2010/wordprocessingInk" xmlns:wne="http://schemas.microsoft.com/office/word/2006/wordml" xmlns:wps="http://schemas.microsoft.com/office/word/2010/wordprocessingShape" mc:Ignorable="w14 w15 w16se w16cid w16 w16cex w16sdtdh w16sdtfl w16du wp14">
+<w:document xmlns:wpc="http://schemas.microsoft.com/office/word/2010/wordprocessingCanvas" xmlns:cx="http://schemas.microsoft.com/office/drawing/2014/chartex" xmlns:cx1="http://schemas.microsoft.com/office/drawing/2015/9/8/chartex" xmlns:cx2="http://schemas.microsoft.com/office/drawing/2015/10/21/chartex" xmlns:cx3="http://schemas.microsoft.com/office/drawing/2016/5/9/chartex" xmlns:cx4="http://schemas.microsoft.com/office/drawing/2016/5/10/chartex" xmlns:cx5="http://schemas.microsoft.com/office/drawing/2016/5/11/chartex" xmlns:cx6="http://schemas.microsoft.com/office/drawing/2016/5/12/chartex" xmlns:cx7="http://schemas.microsoft.com/office/drawing/2016/5/13/chartex" xmlns:cx8="http://schemas.microsoft.com/office/drawing/2016/5/14/chartex" xmlns:mc="http://schemas.openxmlformats.org/markup-compatibility/2006" xmlns:m="http://schemas.openxmlformats.org/officeDocument/2006/math" xmlns:aink="http://schemas.microsoft.com/office/drawing/2016/ink" xmlns:am3d="http://schemas.microsoft.com/office/drawing/2017/model3d" xmlns:oel="http://schemas.microsoft.com/office/2019/extlst" xmlns:r="http://schemas.openxmlformats.org/officeDocument/2006/relationships" xmlns:wp14="http://schemas.microsoft.com/office/word/2010/wordprocessingDrawing" xmlns:wp="http://schemas.openxmlformats.org/drawingml/2006/wordprocessingDrawing" xmlns:wpg="http://schemas.microsoft.com/office/word/2010/wordprocessingGroup" xmlns:wpi="http://schemas.microsoft.com/office/word/2010/wordprocessingInk" xmlns:wps="http://schemas.microsoft.com/office/word/2010/wordprocessingShape" xmlns:o="urn:schemas-microsoft-com:office:office" xmlns:v="urn:schemas-microsoft-com:vml" xmlns:w10="urn:schemas-microsoft-com:office:word" xmlns:w="http://schemas.openxmlformats.org/wordprocessingml/2006/main" xmlns:w14="http://schemas.microsoft.com/office/word/2010/wordml" xmlns:w15="http://schemas.microsoft.com/office/word/2012/wordml" xmlns:w16cei="http://schemas.microsoft.com/office/word/2026/wordml/cei" xmlns:w16cex="http://schemas.microsoft.com/office/word/2018/wordml/cex" xmlns:w16cid="http://schemas.microsoft.com/office/word/2016/wordml/cid" xmlns:w16="http://schemas.microsoft.com/office/word/2018/wordml" xmlns:w16sdtdh="http://schemas.microsoft.com/office/word/2020/wordml/sdtdatahash" xmlns:w16sdtfl="http://schemas.microsoft.com/office/word/2024/wordml/sdtformatlock" xmlns:w16se="http://schemas.microsoft.com/office/word/2015/wordml/symex" xmlns:w16du="http://schemas.microsoft.com/office/word/2023/wordml/word16du" xmlns:wne="http://schemas.microsoft.com/office/word/2006/wordml" mc:Ignorable="w14 w15 w16se w16cid w16 w16cex w16sdtdh w16sdtfl w16du wp14">
   <w:body>
     <w:p>
       <w:pPr>
@@ -288,25 +288,31 @@
         <w:spacing w:line="252" w:lineRule="auto"/>
       </w:pPr>
       <w:r>
-        <w:rPr>
-          <w:sz w:val="19"/>
-          <w:szCs w:val="19"/>
-        </w:rPr>
-        <w:t>Pioneered LLM</w:t>
-      </w:r>
-      <w:r>
-        <w:rPr>
-          <w:sz w:val="19"/>
-          <w:szCs w:val="19"/>
-        </w:rPr>
+        <w:t xml:space="preserve">Built an autonomous </w:t>
+      </w:r>
+      <w:r>
+        <w:t xml:space="preserve">PHY agent </w:t>
+      </w:r>
+      <w:r>
+        <w:t>that</w:t>
+      </w:r>
+      <w:r>
+        <w:t xml:space="preserve"> takes firmware</w:t>
+      </w:r>
+      <w:r>
         <w:t xml:space="preserve"> </w:t>
       </w:r>
       <w:r>
-        <w:rPr>
-          <w:sz w:val="19"/>
-          <w:szCs w:val="19"/>
-        </w:rPr>
-        <w:t>and agent-based tooling, taking early prototypes through to production AI-enabled monitoring and debugging workflows that improved visibility into firmware systems.</w:t>
+        <w:t xml:space="preserve">tickets from intake to code review without supervision, operating under its own identity across </w:t>
+      </w:r>
+      <w:r>
+        <w:t>communication channels,</w:t>
+      </w:r>
+      <w:r>
+        <w:t xml:space="preserve"> hardware access,</w:t>
+      </w:r>
+      <w:r>
+        <w:t xml:space="preserve"> MCP, CLI, memory and skills.</w:t>
       </w:r>
     </w:p>
     <w:p>
@@ -949,7 +955,7 @@
 </file>
 
 <file path=word/numbering.xml><?xml version="1.0" encoding="utf-8"?>
-<w:numbering xmlns:wpc="http://schemas.microsoft.com/office/word/2010/wordprocessingCanvas" xmlns:cx="http://schemas.microsoft.com/office/drawing/2014/chartex" xmlns:cx1="http://schemas.microsoft.com/office/drawing/2015/9/8/chartex" xmlns:cx2="http://schemas.microsoft.com/office/drawing/2015/10/21/chartex" xmlns:cx3="http://schemas.microsoft.com/office/drawing/2016/5/9/chartex" xmlns:cx4="http://schemas.microsoft.com/office/drawing/2016/5/10/chartex" xmlns:cx5="http://schemas.microsoft.com/office/drawing/2016/5/11/chartex" xmlns:cx6="http://schemas.microsoft.com/office/drawing/2016/5/12/chartex" xmlns:cx7="http://schemas.microsoft.com/office/drawing/2016/5/13/chartex" xmlns:cx8="http://schemas.microsoft.com/office/drawing/2016/5/14/chartex" xmlns:mc="http://schemas.openxmlformats.org/markup-compatibility/2006" xmlns:aink="http://schemas.microsoft.com/office/drawing/2016/ink" xmlns:am3d="http://schemas.microsoft.com/office/drawing/2017/model3d" xmlns:o="urn:schemas-microsoft-com:office:office" xmlns:oel="http://schemas.microsoft.com/office/2019/extlst" xmlns:r="http://schemas.openxmlformats.org/officeDocument/2006/relationships" xmlns:m="http://schemas.openxmlformats.org/officeDocument/2006/math" xmlns:v="urn:schemas-microsoft-com:vml" xmlns:wp14="http://schemas.microsoft.com/office/word/2010/wordprocessingDrawing" xmlns:wp="http://schemas.openxmlformats.org/drawingml/2006/wordprocessingDrawing" xmlns:w10="urn:schemas-microsoft-com:office:word" xmlns:w="http://schemas.openxmlformats.org/wordprocessingml/2006/main" xmlns:w14="http://schemas.microsoft.com/office/word/2010/wordml" xmlns:w15="http://schemas.microsoft.com/office/word/2012/wordml" xmlns:w16cex="http://schemas.microsoft.com/office/word/2018/wordml/cex" xmlns:w16cid="http://schemas.microsoft.com/office/word/2016/wordml/cid" xmlns:w16="http://schemas.microsoft.com/office/word/2018/wordml" xmlns:w16du="http://schemas.microsoft.com/office/word/2023/wordml/word16du" xmlns:w16sdtdh="http://schemas.microsoft.com/office/word/2020/wordml/sdtdatahash" xmlns:w16sdtfl="http://schemas.microsoft.com/office/word/2024/wordml/sdtformatlock" xmlns:w16se="http://schemas.microsoft.com/office/word/2015/wordml/symex" xmlns:wpg="http://schemas.microsoft.com/office/word/2010/wordprocessingGroup" xmlns:wpi="http://schemas.microsoft.com/office/word/2010/wordprocessingInk" xmlns:wne="http://schemas.microsoft.com/office/word/2006/wordml" xmlns:wps="http://schemas.microsoft.com/office/word/2010/wordprocessingShape" mc:Ignorable="w14 w15 w16se w16cid w16 w16cex w16sdtdh w16sdtfl w16du wp14">
+<w:numbering xmlns:wpc="http://schemas.microsoft.com/office/word/2010/wordprocessingCanvas" xmlns:cx="http://schemas.microsoft.com/office/drawing/2014/chartex" xmlns:cx1="http://schemas.microsoft.com/office/drawing/2015/9/8/chartex" xmlns:cx2="http://schemas.microsoft.com/office/drawing/2015/10/21/chartex" xmlns:cx3="http://schemas.microsoft.com/office/drawing/2016/5/9/chartex" xmlns:cx4="http://schemas.microsoft.com/office/drawing/2016/5/10/chartex" xmlns:cx5="http://schemas.microsoft.com/office/drawing/2016/5/11/chartex" xmlns:cx6="http://schemas.microsoft.com/office/drawing/2016/5/12/chartex" xmlns:cx7="http://schemas.microsoft.com/office/drawing/2016/5/13/chartex" xmlns:cx8="http://schemas.microsoft.com/office/drawing/2016/5/14/chartex" xmlns:mc="http://schemas.openxmlformats.org/markup-compatibility/2006" xmlns:m="http://schemas.openxmlformats.org/officeDocument/2006/math" xmlns:aink="http://schemas.microsoft.com/office/drawing/2016/ink" xmlns:am3d="http://schemas.microsoft.com/office/drawing/2017/model3d" xmlns:oel="http://schemas.microsoft.com/office/2019/extlst" xmlns:r="http://schemas.openxmlformats.org/officeDocument/2006/relationships" xmlns:wp14="http://schemas.microsoft.com/office/word/2010/wordprocessingDrawing" xmlns:wp="http://schemas.openxmlformats.org/drawingml/2006/wordprocessingDrawing" xmlns:wpg="http://schemas.microsoft.com/office/word/2010/wordprocessingGroup" xmlns:wpi="http://schemas.microsoft.com/office/word/2010/wordprocessingInk" xmlns:wps="http://schemas.microsoft.com/office/word/2010/wordprocessingShape" xmlns:o="urn:schemas-microsoft-com:office:office" xmlns:v="urn:schemas-microsoft-com:vml" xmlns:w10="urn:schemas-microsoft-com:office:word" xmlns:w="http://schemas.openxmlformats.org/wordprocessingml/2006/main" xmlns:w14="http://schemas.microsoft.com/office/word/2010/wordml" xmlns:w15="http://schemas.microsoft.com/office/word/2012/wordml" xmlns:w16cei="http://schemas.microsoft.com/office/word/2026/wordml/cei" xmlns:w16cex="http://schemas.microsoft.com/office/word/2018/wordml/cex" xmlns:w16cid="http://schemas.microsoft.com/office/word/2016/wordml/cid" xmlns:w16="http://schemas.microsoft.com/office/word/2018/wordml" xmlns:w16sdtdh="http://schemas.microsoft.com/office/word/2020/wordml/sdtdatahash" xmlns:w16sdtfl="http://schemas.microsoft.com/office/word/2024/wordml/sdtformatlock" xmlns:w16se="http://schemas.microsoft.com/office/word/2015/wordml/symex" xmlns:w16du="http://schemas.microsoft.com/office/word/2023/wordml/word16du" xmlns:wne="http://schemas.microsoft.com/office/word/2006/wordml" mc:Ignorable="w14 w15 w16se w16cid w16 w16cex w16sdtdh w16sdtfl w16du wp14">
   <w:abstractNum w:abstractNumId="0" w15:restartNumberingAfterBreak="0">
     <w:nsid w:val="228623A6"/>
     <w:multiLevelType w:val="hybridMultilevel"/>
@@ -1113,7 +1119,7 @@
 </file>
 
 <file path=word/styles.xml><?xml version="1.0" encoding="utf-8"?>
-<w:styles xmlns:mc="http://schemas.openxmlformats.org/markup-compatibility/2006" xmlns:r="http://schemas.openxmlformats.org/officeDocument/2006/relationships" xmlns:w="http://schemas.openxmlformats.org/wordprocessingml/2006/main" xmlns:w14="http://schemas.microsoft.com/office/word/2010/wordml" xmlns:w15="http://schemas.microsoft.com/office/word/2012/wordml" xmlns:w16cex="http://schemas.microsoft.com/office/word/2018/wordml/cex" xmlns:w16cid="http://schemas.microsoft.com/office/word/2016/wordml/cid" xmlns:w16="http://schemas.microsoft.com/office/word/2018/wordml" xmlns:w16du="http://schemas.microsoft.com/office/word/2023/wordml/word16du" xmlns:w16sdtdh="http://schemas.microsoft.com/office/word/2020/wordml/sdtdatahash" xmlns:w16sdtfl="http://schemas.microsoft.com/office/word/2024/wordml/sdtformatlock" xmlns:w16se="http://schemas.microsoft.com/office/word/2015/wordml/symex" mc:Ignorable="w14 w15 w16se w16cid w16 w16cex w16sdtdh w16sdtfl w16du">
+<w:styles xmlns:mc="http://schemas.openxmlformats.org/markup-compatibility/2006" xmlns:r="http://schemas.openxmlformats.org/officeDocument/2006/relationships" xmlns:w="http://schemas.openxmlformats.org/wordprocessingml/2006/main" xmlns:w14="http://schemas.microsoft.com/office/word/2010/wordml" xmlns:w15="http://schemas.microsoft.com/office/word/2012/wordml" xmlns:w16cex="http://schemas.microsoft.com/office/word/2018/wordml/cex" xmlns:w16cid="http://schemas.microsoft.com/office/word/2016/wordml/cid" xmlns:w16="http://schemas.microsoft.com/office/word/2018/wordml" xmlns:w16sdtdh="http://schemas.microsoft.com/office/word/2020/wordml/sdtdatahash" xmlns:w16sdtfl="http://schemas.microsoft.com/office/word/2024/wordml/sdtformatlock" xmlns:w16se="http://schemas.microsoft.com/office/word/2015/wordml/symex" xmlns:w16du="http://schemas.microsoft.com/office/word/2023/wordml/word16du" mc:Ignorable="w14 w15 w16se w16cid w16 w16cex w16sdtdh w16sdtfl w16du">
   <w:docDefaults>
     <w:rPrDefault>
       <w:rPr>

</xml_diff>